<commit_message>
anidamiento de los tests y fin definitivo del código
</commit_message>
<xml_diff>
--- a/documentacion/UT_7_2026_2027.docx
+++ b/documentacion/UT_7_2026_2027.docx
@@ -6043,9 +6043,9 @@
       </w:r>
     </w:p>
     <w:p/>
-    <w:bookmarkStart w:id="6" w:name="_Toc49341785" w:displacedByCustomXml="next"/>
+    <w:bookmarkStart w:id="6" w:name="_Toc182500112" w:displacedByCustomXml="next"/>
     <w:bookmarkStart w:id="7" w:name="_Toc182218937" w:displacedByCustomXml="next"/>
-    <w:bookmarkStart w:id="8" w:name="_Toc182500112" w:displacedByCustomXml="next"/>
+    <w:bookmarkStart w:id="8" w:name="_Toc49341785" w:displacedByCustomXml="next"/>
     <w:sdt>
       <w:sdtPr>
         <w:rPr>
@@ -7519,7 +7519,7 @@
                 <v:path o:extrusionok="f" gradientshapeok="t" o:connecttype="rect"/>
                 <o:lock v:ext="edit" aspectratio="t"/>
               </v:shapetype>
-              <v:shape id="_x0000_i1034" type="#_x0000_t75" style="width:465.75pt;height:205.3pt">
+              <v:shape id="_x0000_i1025" type="#_x0000_t75" style="width:465.75pt;height:205.3pt">
                 <v:imagedata r:id="rId15" o:title="SecuencaciónFasesProyecto"/>
               </v:shape>
             </w:pict>
@@ -7546,7 +7546,7 @@
           </w:pPr>
           <w:r>
             <w:pict w14:anchorId="5636CC0F">
-              <v:shape id="_x0000_i1035" type="#_x0000_t75" style="width:383.2pt;height:241.8pt">
+              <v:shape id="_x0000_i1026" type="#_x0000_t75" style="width:383.2pt;height:241.8pt">
                 <v:imagedata r:id="rId16" o:title="PlanificaciónRecursosProyectos"/>
               </v:shape>
             </w:pict>
@@ -11699,7 +11699,7 @@
       </w:pPr>
       <w:r>
         <w:pict w14:anchorId="119133E6">
-          <v:shape id="_x0000_i1036" type="#_x0000_t75" style="width:253.25pt;height:469.4pt">
+          <v:shape id="_x0000_i1027" type="#_x0000_t75" style="width:253.25pt;height:469.4pt">
             <v:imagedata r:id="rId25" o:title="DA_Login"/>
           </v:shape>
         </w:pict>
@@ -24478,7 +24478,7 @@
           <w:noProof/>
         </w:rPr>
         <w:drawing>
-          <wp:inline distT="0" distB="0" distL="0" distR="0" wp14:anchorId="07857708" wp14:editId="4A00F821">
+          <wp:inline distT="0" distB="0" distL="0" distR="0" wp14:anchorId="07857708" wp14:editId="497BCE27">
             <wp:extent cx="6371590" cy="3344545"/>
             <wp:effectExtent l="0" t="0" r="0" b="8255"/>
             <wp:docPr id="824572767" name="Imagen 9"/>
@@ -24520,7 +24520,6 @@
         </w:drawing>
       </w:r>
     </w:p>
-    <w:p/>
     <w:p>
       <w:pPr>
         <w:spacing w:after="200"/>
@@ -24531,9 +24530,6 @@
           <w:color w:val="012639" w:themeColor="accent1" w:themeShade="7F"/>
         </w:rPr>
       </w:pPr>
-      <w:r>
-        <w:br w:type="page"/>
-      </w:r>
       <w:r>
         <w:rPr>
           <w:noProof/>
@@ -24631,7 +24627,6 @@
         </w:rPr>
       </w:pPr>
       <w:r>
-        <w:lastRenderedPageBreak/>
         <w:br w:type="page"/>
       </w:r>
     </w:p>
@@ -24681,10 +24676,10 @@
       <w:bookmarkStart w:id="150" w:name="_Toc49341830"/>
       <w:bookmarkStart w:id="151" w:name="_Toc182218978"/>
       <w:bookmarkStart w:id="152" w:name="_Toc182500155"/>
-      <w:bookmarkStart w:id="153" w:name="_Toc49341858"/>
-      <w:bookmarkStart w:id="154" w:name="_Toc182218988"/>
-      <w:bookmarkStart w:id="155" w:name="_Toc182500166"/>
-      <w:bookmarkStart w:id="156" w:name="_Ref230451774"/>
+      <w:bookmarkStart w:id="153" w:name="_Ref230451774"/>
+      <w:bookmarkStart w:id="154" w:name="_Toc49341858"/>
+      <w:bookmarkStart w:id="155" w:name="_Toc182218988"/>
+      <w:bookmarkStart w:id="156" w:name="_Toc182500166"/>
       <w:r>
         <w:lastRenderedPageBreak/>
         <w:t>Sql de creación (MySQL)</w:t>
@@ -24692,7 +24687,7 @@
       <w:bookmarkEnd w:id="150"/>
       <w:bookmarkEnd w:id="151"/>
       <w:bookmarkEnd w:id="152"/>
-      <w:bookmarkEnd w:id="156"/>
+      <w:bookmarkEnd w:id="153"/>
     </w:p>
     <w:p>
       <w:pPr>
@@ -24705,96 +24700,120 @@
     <w:p>
       <w:pPr>
         <w:jc w:val="left"/>
-      </w:pPr>
-      <w:r>
-        <w:t>-- Host:                         127.0.0.1</w:t>
+        <w:rPr>
+          <w:lang w:val="en-US"/>
+        </w:rPr>
+      </w:pPr>
+      <w:r>
+        <w:rPr>
+          <w:lang w:val="en-US"/>
+        </w:rPr>
+        <w:t>-- phpMyAdmin SQL Dump</w:t>
       </w:r>
     </w:p>
     <w:p>
       <w:pPr>
         <w:jc w:val="left"/>
-      </w:pPr>
-      <w:r>
-        <w:t>-- Versión del servidor:         10.4.24-MariaDB-1:10.4.24+maria~focal - mariadb.org binary distribution</w:t>
+        <w:rPr>
+          <w:lang w:val="en-US"/>
+        </w:rPr>
+      </w:pPr>
+      <w:r>
+        <w:rPr>
+          <w:lang w:val="en-US"/>
+        </w:rPr>
+        <w:t>-- version 5.2.3</w:t>
       </w:r>
     </w:p>
     <w:p>
       <w:pPr>
         <w:jc w:val="left"/>
-      </w:pPr>
-      <w:r>
-        <w:t>-- SO del servidor:              debian-linux-gnu</w:t>
+        <w:rPr>
+          <w:lang w:val="en-US"/>
+        </w:rPr>
+      </w:pPr>
+      <w:r>
+        <w:rPr>
+          <w:lang w:val="en-US"/>
+        </w:rPr>
+        <w:t>-- https://www.phpmyadmin.net/</w:t>
       </w:r>
     </w:p>
     <w:p>
       <w:pPr>
         <w:jc w:val="left"/>
-      </w:pPr>
-      <w:r>
-        <w:t>-- HeidiSQL Versión:             12.6.0.6765</w:t>
+        <w:rPr>
+          <w:lang w:val="en-US"/>
+        </w:rPr>
+      </w:pPr>
+      <w:r>
+        <w:rPr>
+          <w:lang w:val="en-US"/>
+        </w:rPr>
+        <w:t>--</w:t>
       </w:r>
     </w:p>
     <w:p>
       <w:pPr>
         <w:jc w:val="left"/>
-      </w:pPr>
-      <w:r>
-        <w:t>-- --------------------------------------------------------</w:t>
+        <w:rPr>
+          <w:lang w:val="en-US"/>
+        </w:rPr>
+      </w:pPr>
+      <w:r>
+        <w:rPr>
+          <w:lang w:val="en-US"/>
+        </w:rPr>
+        <w:t>-- Host: mysql_daw1</w:t>
       </w:r>
     </w:p>
     <w:p>
       <w:pPr>
         <w:jc w:val="left"/>
-      </w:pPr>
+        <w:rPr>
+          <w:lang w:val="en-US"/>
+        </w:rPr>
+      </w:pPr>
+      <w:r>
+        <w:rPr>
+          <w:lang w:val="en-US"/>
+        </w:rPr>
+        <w:t>-- Server version: 9.7.0</w:t>
+      </w:r>
     </w:p>
     <w:p>
       <w:pPr>
         <w:jc w:val="left"/>
-      </w:pPr>
-      <w:r>
-        <w:t>/*!40101 SET @OLD_CHARACTER_SET_CLIENT=@@CHARACTER_SET_CLIENT */;</w:t>
+        <w:rPr>
+          <w:lang w:val="en-US"/>
+        </w:rPr>
+      </w:pPr>
+      <w:r>
+        <w:rPr>
+          <w:lang w:val="en-US"/>
+        </w:rPr>
+        <w:t>-- PHP Version: 8.3.31</w:t>
       </w:r>
     </w:p>
     <w:p>
       <w:pPr>
         <w:jc w:val="left"/>
-        <w:rPr>
-          <w:lang w:val="en-GB"/>
-        </w:rPr>
-      </w:pPr>
-      <w:r>
-        <w:rPr>
-          <w:lang w:val="en-GB"/>
-        </w:rPr>
-        <w:t>/*!40101 SET NAMES utf8 */;</w:t>
+      </w:pPr>
+      <w:r>
+        <w:t>-- --------------------------------------------------------</w:t>
       </w:r>
     </w:p>
     <w:p>
       <w:pPr>
         <w:jc w:val="left"/>
-        <w:rPr>
-          <w:lang w:val="en-GB"/>
-        </w:rPr>
-      </w:pPr>
-      <w:r>
-        <w:rPr>
-          <w:lang w:val="en-GB"/>
-        </w:rPr>
-        <w:t>/*!50503 SET NAMES utf8mb4 */;</w:t>
-      </w:r>
+      </w:pPr>
     </w:p>
     <w:p>
       <w:pPr>
         <w:jc w:val="left"/>
-        <w:rPr>
-          <w:lang w:val="en-GB"/>
-        </w:rPr>
-      </w:pPr>
-      <w:r>
-        <w:rPr>
-          <w:lang w:val="en-GB"/>
-        </w:rPr>
-        <w:t>/*!40103 SET @OLD_TIME_ZONE=@@TIME_ZONE */;</w:t>
+      </w:pPr>
+      <w:r>
+        <w:t>/*!40101 SET @OLD_CHARACTER_SET_CLIENT=@@CHARACTER_SET_CLIENT */;</w:t>
       </w:r>
     </w:p>
     <w:p>
@@ -24808,7 +24827,7 @@
         <w:rPr>
           <w:lang w:val="en-GB"/>
         </w:rPr>
-        <w:t>/*!40103 SET TIME_ZONE='+00:00' */;</w:t>
+        <w:t>/*!40101 SET NAMES utf8 */;</w:t>
       </w:r>
     </w:p>
     <w:p>
@@ -24822,7 +24841,7 @@
         <w:rPr>
           <w:lang w:val="en-GB"/>
         </w:rPr>
-        <w:t>/*!40014 SET @OLD_FOREIGN_KEY_CHECKS=@@FOREIGN_KEY_CHECKS, FOREIGN_KEY_CHECKS=0 */;</w:t>
+        <w:t>/*!50503 SET NAMES utf8mb4 */;</w:t>
       </w:r>
     </w:p>
     <w:p>
@@ -24836,7 +24855,7 @@
         <w:rPr>
           <w:lang w:val="en-GB"/>
         </w:rPr>
-        <w:t>/*!40101 SET @OLD_SQL_MODE=@@SQL_MODE, SQL_MODE='NO_AUTO_VALUE_ON_ZERO' */;</w:t>
+        <w:t>/*!40103 SET @OLD_TIME_ZONE=@@TIME_ZONE */;</w:t>
       </w:r>
     </w:p>
     <w:p>
@@ -24850,7 +24869,7 @@
         <w:rPr>
           <w:lang w:val="en-GB"/>
         </w:rPr>
-        <w:t>/*!40111 SET @OLD_SQL_NOTES=@@SQL_NOTES, SQL_NOTES=0 */;</w:t>
+        <w:t>/*!40103 SET TIME_ZONE='+00:00' */;</w:t>
       </w:r>
     </w:p>
     <w:p>
@@ -24860,13 +24879,25 @@
           <w:lang w:val="en-GB"/>
         </w:rPr>
       </w:pPr>
+      <w:r>
+        <w:rPr>
+          <w:lang w:val="en-GB"/>
+        </w:rPr>
+        <w:t>/*!40014 SET @OLD_FOREIGN_KEY_CHECKS=@@FOREIGN_KEY_CHECKS, FOREIGN_KEY_CHECKS=0 */;</w:t>
+      </w:r>
     </w:p>
     <w:p>
       <w:pPr>
         <w:jc w:val="left"/>
-      </w:pPr>
-      <w:r>
-        <w:t>-- Volcando estructura para tabla guardias.aulas</w:t>
+        <w:rPr>
+          <w:lang w:val="en-GB"/>
+        </w:rPr>
+      </w:pPr>
+      <w:r>
+        <w:rPr>
+          <w:lang w:val="en-GB"/>
+        </w:rPr>
+        <w:t>/*!40101 SET @OLD_SQL_MODE=@@SQL_MODE, SQL_MODE='NO_AUTO_VALUE_ON_ZERO' */;</w:t>
       </w:r>
     </w:p>
     <w:p>
@@ -24880,7 +24911,7 @@
         <w:rPr>
           <w:lang w:val="en-GB"/>
         </w:rPr>
-        <w:t>CREATE TABLE IF NOT EXISTS `aulas` (</w:t>
+        <w:t>/*!40111 SET @OLD_SQL_NOTES=@@SQL_NOTES, SQL_NOTES=0 */;</w:t>
       </w:r>
     </w:p>
     <w:p>
@@ -24890,37 +24921,13 @@
           <w:lang w:val="en-GB"/>
         </w:rPr>
       </w:pPr>
-      <w:r>
-        <w:rPr>
-          <w:lang w:val="en-GB"/>
-        </w:rPr>
-        <w:t xml:space="preserve">  `nombre` </w:t>
-      </w:r>
-      <w:r>
-        <w:rPr>
-          <w:lang w:val="en-GB"/>
-        </w:rPr>
-        <w:t xml:space="preserve">varchar(100) </w:t>
-      </w:r>
-      <w:r>
-        <w:rPr>
-          <w:lang w:val="en-GB"/>
-        </w:rPr>
-        <w:t>COLLATE utf8_spanish2_ci NOT NULL,</w:t>
-      </w:r>
     </w:p>
     <w:p>
       <w:pPr>
         <w:jc w:val="left"/>
-        <w:rPr>
-          <w:lang w:val="en-GB"/>
-        </w:rPr>
-      </w:pPr>
-      <w:r>
-        <w:rPr>
-          <w:lang w:val="en-GB"/>
-        </w:rPr>
-        <w:t xml:space="preserve">  PRIMARY KEY (`nombre`)</w:t>
+      </w:pPr>
+      <w:r>
+        <w:t>-- Volcando estructura para tabla guardias.aulas</w:t>
       </w:r>
     </w:p>
     <w:p>
@@ -24934,7 +24941,7 @@
         <w:rPr>
           <w:lang w:val="en-GB"/>
         </w:rPr>
-        <w:t>) ENGINE=InnoDB DEFAULT CHARSET=utf8 COLLATE=utf8_spanish2_ci;</w:t>
+        <w:t>CREATE TABLE IF NOT EXISTS `aulas` (</w:t>
       </w:r>
     </w:p>
     <w:p>
@@ -24944,13 +24951,37 @@
           <w:lang w:val="en-GB"/>
         </w:rPr>
       </w:pPr>
+      <w:r>
+        <w:rPr>
+          <w:lang w:val="en-GB"/>
+        </w:rPr>
+        <w:t xml:space="preserve">  `nombre` </w:t>
+      </w:r>
+      <w:r>
+        <w:rPr>
+          <w:lang w:val="en-GB"/>
+        </w:rPr>
+        <w:t xml:space="preserve">varchar(100) </w:t>
+      </w:r>
+      <w:r>
+        <w:rPr>
+          <w:lang w:val="en-GB"/>
+        </w:rPr>
+        <w:t>COLLATE utf8_spanish2_ci NOT NULL,</w:t>
+      </w:r>
     </w:p>
     <w:p>
       <w:pPr>
         <w:jc w:val="left"/>
-      </w:pPr>
-      <w:r>
-        <w:t>-- Volcando estructura para tabla guardias.cursos</w:t>
+        <w:rPr>
+          <w:lang w:val="en-GB"/>
+        </w:rPr>
+      </w:pPr>
+      <w:r>
+        <w:rPr>
+          <w:lang w:val="en-GB"/>
+        </w:rPr>
+        <w:t xml:space="preserve">  PRIMARY KEY (`nombre`)</w:t>
       </w:r>
     </w:p>
     <w:p>
@@ -24964,7 +24995,7 @@
         <w:rPr>
           <w:lang w:val="en-GB"/>
         </w:rPr>
-        <w:t>CREATE TABLE IF NOT EXISTS `cursos` (</w:t>
+        <w:t>) ENGINE=InnoDB DEFAULT CHARSET=utf8 COLLATE=utf8_spanish2_ci;</w:t>
       </w:r>
     </w:p>
     <w:p>
@@ -24974,37 +25005,13 @@
           <w:lang w:val="en-GB"/>
         </w:rPr>
       </w:pPr>
-      <w:r>
-        <w:rPr>
-          <w:lang w:val="en-GB"/>
-        </w:rPr>
-        <w:t xml:space="preserve">  `nombre` </w:t>
-      </w:r>
-      <w:r>
-        <w:rPr>
-          <w:lang w:val="en-GB"/>
-        </w:rPr>
-        <w:t xml:space="preserve">varchar(100) </w:t>
-      </w:r>
-      <w:r>
-        <w:rPr>
-          <w:lang w:val="en-GB"/>
-        </w:rPr>
-        <w:t>COLLATE utf8_spanish2_ci NOT NULL,</w:t>
-      </w:r>
     </w:p>
     <w:p>
       <w:pPr>
         <w:jc w:val="left"/>
-        <w:rPr>
-          <w:lang w:val="en-GB"/>
-        </w:rPr>
-      </w:pPr>
-      <w:r>
-        <w:rPr>
-          <w:lang w:val="en-GB"/>
-        </w:rPr>
-        <w:t xml:space="preserve">  PRIMARY KEY (`nombre`)</w:t>
+      </w:pPr>
+      <w:r>
+        <w:t>-- Volcando estructura para tabla guardias.cursos</w:t>
       </w:r>
     </w:p>
     <w:p>
@@ -25018,7 +25025,7 @@
         <w:rPr>
           <w:lang w:val="en-GB"/>
         </w:rPr>
-        <w:t>) ENGINE=InnoDB DEFAULT CHARSET=utf8 COLLATE=utf8_spanish2_ci;</w:t>
+        <w:t>CREATE TABLE IF NOT EXISTS `cursos` (</w:t>
       </w:r>
     </w:p>
     <w:p>
@@ -25028,13 +25035,37 @@
           <w:lang w:val="en-GB"/>
         </w:rPr>
       </w:pPr>
+      <w:r>
+        <w:rPr>
+          <w:lang w:val="en-GB"/>
+        </w:rPr>
+        <w:t xml:space="preserve">  `nombre` </w:t>
+      </w:r>
+      <w:r>
+        <w:rPr>
+          <w:lang w:val="en-GB"/>
+        </w:rPr>
+        <w:t xml:space="preserve">varchar(100) </w:t>
+      </w:r>
+      <w:r>
+        <w:rPr>
+          <w:lang w:val="en-GB"/>
+        </w:rPr>
+        <w:t>COLLATE utf8_spanish2_ci NOT NULL,</w:t>
+      </w:r>
     </w:p>
     <w:p>
       <w:pPr>
         <w:jc w:val="left"/>
-      </w:pPr>
-      <w:r>
-        <w:t>-- Volcando estructura para tabla guardias.guardias</w:t>
+        <w:rPr>
+          <w:lang w:val="en-GB"/>
+        </w:rPr>
+      </w:pPr>
+      <w:r>
+        <w:rPr>
+          <w:lang w:val="en-GB"/>
+        </w:rPr>
+        <w:t xml:space="preserve">  PRIMARY KEY (`nombre`)</w:t>
       </w:r>
     </w:p>
     <w:p>
@@ -25048,7 +25079,7 @@
         <w:rPr>
           <w:lang w:val="en-GB"/>
         </w:rPr>
-        <w:t>CREATE TABLE IF NOT EXISTS `guardias` (</w:t>
+        <w:t>) ENGINE=InnoDB DEFAULT CHARSET=utf8 COLLATE=utf8_spanish2_ci;</w:t>
       </w:r>
     </w:p>
     <w:p>
@@ -25058,37 +25089,13 @@
           <w:lang w:val="en-GB"/>
         </w:rPr>
       </w:pPr>
-      <w:r>
-        <w:rPr>
-          <w:lang w:val="en-GB"/>
-        </w:rPr>
-        <w:t xml:space="preserve">  `id` </w:t>
-      </w:r>
-      <w:r>
-        <w:rPr>
-          <w:lang w:val="en-GB"/>
-        </w:rPr>
-        <w:t xml:space="preserve">varchar(100) </w:t>
-      </w:r>
-      <w:r>
-        <w:rPr>
-          <w:lang w:val="en-GB"/>
-        </w:rPr>
-        <w:t>COLLATE utf8_spanish2_ci NOT NULL,</w:t>
-      </w:r>
     </w:p>
     <w:p>
       <w:pPr>
         <w:jc w:val="left"/>
-        <w:rPr>
-          <w:lang w:val="en-GB"/>
-        </w:rPr>
-      </w:pPr>
-      <w:r>
-        <w:rPr>
-          <w:lang w:val="en-GB"/>
-        </w:rPr>
-        <w:t xml:space="preserve">  `dia` date NOT NULL,</w:t>
+      </w:pPr>
+      <w:r>
+        <w:t>-- Volcando estructura para tabla guardias.guardias</w:t>
       </w:r>
     </w:p>
     <w:p>
@@ -25102,19 +25109,7 @@
         <w:rPr>
           <w:lang w:val="en-GB"/>
         </w:rPr>
-        <w:t xml:space="preserve">  `hora` </w:t>
-      </w:r>
-      <w:r>
-        <w:rPr>
-          <w:lang w:val="en-GB"/>
-        </w:rPr>
-        <w:t xml:space="preserve">varchar(100) </w:t>
-      </w:r>
-      <w:r>
-        <w:rPr>
-          <w:lang w:val="en-GB"/>
-        </w:rPr>
-        <w:t>COLLATE utf8_spanish2_ci NOT NULL DEFAULT '',</w:t>
+        <w:t>CREATE TABLE IF NOT EXISTS `guardias` (</w:t>
       </w:r>
     </w:p>
     <w:p>
@@ -25128,7 +25123,7 @@
         <w:rPr>
           <w:lang w:val="en-GB"/>
         </w:rPr>
-        <w:t xml:space="preserve">  `curso` </w:t>
+        <w:t xml:space="preserve">  `id` </w:t>
       </w:r>
       <w:r>
         <w:rPr>
@@ -25140,7 +25135,7 @@
         <w:rPr>
           <w:lang w:val="en-GB"/>
         </w:rPr>
-        <w:t>COLLATE utf8_spanish2_ci NOT NULL DEFAULT '',</w:t>
+        <w:t>COLLATE utf8_spanish2_ci NOT NULL,</w:t>
       </w:r>
     </w:p>
     <w:p>
@@ -25154,19 +25149,7 @@
         <w:rPr>
           <w:lang w:val="en-GB"/>
         </w:rPr>
-        <w:t xml:space="preserve">  `aula` </w:t>
-      </w:r>
-      <w:r>
-        <w:rPr>
-          <w:lang w:val="en-GB"/>
-        </w:rPr>
-        <w:t xml:space="preserve">varchar(100) </w:t>
-      </w:r>
-      <w:r>
-        <w:rPr>
-          <w:lang w:val="en-GB"/>
-        </w:rPr>
-        <w:t>COLLATE utf8_spanish2_ci NOT NULL DEFAULT '',</w:t>
+        <w:t xml:space="preserve">  `dia` date NOT NULL,</w:t>
       </w:r>
     </w:p>
     <w:p>
@@ -25180,7 +25163,19 @@
         <w:rPr>
           <w:lang w:val="en-GB"/>
         </w:rPr>
-        <w:t xml:space="preserve">  `tarea` varchar(1) COLLATE utf8_spanish2_ci NOT NULL DEFAULT 'N',</w:t>
+        <w:t xml:space="preserve">  `hora` </w:t>
+      </w:r>
+      <w:r>
+        <w:rPr>
+          <w:lang w:val="en-GB"/>
+        </w:rPr>
+        <w:t xml:space="preserve">varchar(100) </w:t>
+      </w:r>
+      <w:r>
+        <w:rPr>
+          <w:lang w:val="en-GB"/>
+        </w:rPr>
+        <w:t>COLLATE utf8_spanish2_ci NOT NULL DEFAULT '',</w:t>
       </w:r>
     </w:p>
     <w:p>
@@ -25194,7 +25189,19 @@
         <w:rPr>
           <w:lang w:val="en-GB"/>
         </w:rPr>
-        <w:t xml:space="preserve">  `ficheros` mediumtext COLLATE utf8_spanish2_ci DEFAULT NULL,</w:t>
+        <w:t xml:space="preserve">  `curso` </w:t>
+      </w:r>
+      <w:r>
+        <w:rPr>
+          <w:lang w:val="en-GB"/>
+        </w:rPr>
+        <w:t xml:space="preserve">varchar(100) </w:t>
+      </w:r>
+      <w:r>
+        <w:rPr>
+          <w:lang w:val="en-GB"/>
+        </w:rPr>
+        <w:t>COLLATE utf8_spanish2_ci NOT NULL DEFAULT '',</w:t>
       </w:r>
     </w:p>
     <w:p>
@@ -25208,29 +25215,47 @@
         <w:rPr>
           <w:lang w:val="en-GB"/>
         </w:rPr>
-        <w:t xml:space="preserve">  PRIMARY KEY (`id`,`dia`,`hora`),</w:t>
+        <w:t xml:space="preserve">  `aula` </w:t>
+      </w:r>
+      <w:r>
+        <w:rPr>
+          <w:lang w:val="en-GB"/>
+        </w:rPr>
+        <w:t xml:space="preserve">varchar(100) </w:t>
+      </w:r>
+      <w:r>
+        <w:rPr>
+          <w:lang w:val="en-GB"/>
+        </w:rPr>
+        <w:t>COLLATE utf8_spanish2_ci NOT NULL DEFAULT '',</w:t>
       </w:r>
     </w:p>
     <w:p>
       <w:pPr>
         <w:jc w:val="left"/>
-      </w:pPr>
-      <w:r>
         <w:rPr>
           <w:lang w:val="en-GB"/>
         </w:rPr>
-        <w:t xml:space="preserve">  </w:t>
-      </w:r>
-      <w:r>
-        <w:t>KEY `FK_horas` (`hora`),</w:t>
+      </w:pPr>
+      <w:r>
+        <w:rPr>
+          <w:lang w:val="en-GB"/>
+        </w:rPr>
+        <w:t xml:space="preserve">  `tarea` varchar(1) COLLATE utf8_spanish2_ci NOT NULL DEFAULT 'N',</w:t>
       </w:r>
     </w:p>
     <w:p>
       <w:pPr>
         <w:jc w:val="left"/>
-      </w:pPr>
-      <w:r>
-        <w:t xml:space="preserve">  KEY `FK_curso` (`curso`),</w:t>
+        <w:rPr>
+          <w:lang w:val="en-GB"/>
+        </w:rPr>
+      </w:pPr>
+      <w:r>
+        <w:rPr>
+          <w:lang w:val="en-GB"/>
+        </w:rPr>
+        <w:t xml:space="preserve">  `ficheros` mediumtext COLLATE utf8_spanish2_ci DEFAULT NULL,</w:t>
       </w:r>
     </w:p>
     <w:p>
@@ -25241,27 +25266,63 @@
         </w:rPr>
       </w:pPr>
       <w:r>
-        <w:t xml:space="preserve">  </w:t>
-      </w:r>
-      <w:r>
         <w:rPr>
           <w:lang w:val="en-GB"/>
         </w:rPr>
-        <w:t>KEY `FK_aulas` (`aula`),</w:t>
+        <w:t xml:space="preserve">  PRIMARY KEY (`id`,`dia`,`hora`),</w:t>
       </w:r>
     </w:p>
     <w:p>
       <w:pPr>
         <w:jc w:val="left"/>
+      </w:pPr>
+      <w:r>
         <w:rPr>
           <w:lang w:val="en-GB"/>
         </w:rPr>
-      </w:pPr>
-      <w:r>
+        <w:lastRenderedPageBreak/>
+        <w:t xml:space="preserve">  </w:t>
+      </w:r>
+      <w:r>
+        <w:t>KEY `FK_horas` (`hora`),</w:t>
+      </w:r>
+    </w:p>
+    <w:p>
+      <w:pPr>
+        <w:jc w:val="left"/>
+      </w:pPr>
+      <w:r>
+        <w:t xml:space="preserve">  KEY `FK_curso` (`curso`),</w:t>
+      </w:r>
+    </w:p>
+    <w:p>
+      <w:pPr>
+        <w:jc w:val="left"/>
         <w:rPr>
           <w:lang w:val="en-GB"/>
         </w:rPr>
-        <w:lastRenderedPageBreak/>
+      </w:pPr>
+      <w:r>
+        <w:t xml:space="preserve">  </w:t>
+      </w:r>
+      <w:r>
+        <w:rPr>
+          <w:lang w:val="en-GB"/>
+        </w:rPr>
+        <w:t>KEY `FK_aulas` (`aula`),</w:t>
+      </w:r>
+    </w:p>
+    <w:p>
+      <w:pPr>
+        <w:jc w:val="left"/>
+        <w:rPr>
+          <w:lang w:val="en-GB"/>
+        </w:rPr>
+      </w:pPr>
+      <w:r>
+        <w:rPr>
+          <w:lang w:val="en-GB"/>
+        </w:rPr>
         <w:t xml:space="preserve">  CONSTRAINT `FK_aulas` FOREIGN KEY (`aula`) REFERENCES `aulas` (`nombre`) ON DELETE NO ACTION ON UPDATE NO ACTION,</w:t>
       </w:r>
     </w:p>
@@ -25613,9 +25674,9 @@
         <w:lastRenderedPageBreak/>
         <w:t>Indicadores de calidad</w:t>
       </w:r>
-      <w:bookmarkEnd w:id="153"/>
       <w:bookmarkEnd w:id="154"/>
       <w:bookmarkEnd w:id="155"/>
+      <w:bookmarkEnd w:id="156"/>
     </w:p>
     <w:tbl>
       <w:tblPr>
@@ -29447,27 +29508,219 @@
     </w:p>
     <w:p>
       <w:pPr>
-        <w:pBdr>
-          <w:top w:val="single" w:sz="4" w:space="1" w:color="FF0000"/>
-          <w:left w:val="single" w:sz="4" w:space="4" w:color="FF0000"/>
-          <w:bottom w:val="single" w:sz="4" w:space="1" w:color="FF0000"/>
-          <w:right w:val="single" w:sz="4" w:space="4" w:color="FF0000"/>
-        </w:pBdr>
-        <w:rPr>
-          <w:color w:val="FF0000"/>
-        </w:rPr>
-      </w:pPr>
-      <w:r>
-        <w:rPr>
-          <w:color w:val="FF0000"/>
-        </w:rPr>
-        <w:t>Hacer…..</w:t>
-      </w:r>
-      <w:r>
-        <w:rPr>
-          <w:color w:val="FF0000"/>
-        </w:rPr>
-        <w:t>// problemas y soluciones que he dado</w:t>
+        <w:pStyle w:val="Ttulo3"/>
+        <w:spacing w:line="360" w:lineRule="auto"/>
+      </w:pPr>
+      <w:r>
+        <w:t>Vaciado de Tablas</w:t>
+      </w:r>
+    </w:p>
+    <w:p>
+      <w:r>
+        <w:t xml:space="preserve">Las sentencias SQL, concretamente el </w:t>
+      </w:r>
+      <w:r>
+        <w:rPr>
+          <w:i/>
+          <w:iCs/>
+        </w:rPr>
+        <w:t>DELETE FROM nombre_tabla</w:t>
+      </w:r>
+      <w:r>
+        <w:t xml:space="preserve">, no ejercía su función y daba error, diciendo que no puede ejecutar la sentencia debido a las restricciones de Foreign Key. Ante este incidente se decidió anular la restricción al principio de la ejecución con la sentencia </w:t>
+      </w:r>
+      <w:r>
+        <w:rPr>
+          <w:i/>
+          <w:iCs/>
+        </w:rPr>
+        <w:t>SET FOREIGN_KEY_CHECKS = 0</w:t>
+      </w:r>
+      <w:r>
+        <w:rPr>
+          <w:i/>
+          <w:iCs/>
+        </w:rPr>
+        <w:t xml:space="preserve"> </w:t>
+      </w:r>
+      <w:r>
+        <w:t>y restaurarla al final (</w:t>
+      </w:r>
+      <w:r>
+        <w:rPr>
+          <w:i/>
+          <w:iCs/>
+        </w:rPr>
+        <w:t>SET FOREIGN_KEY_CHECKS = 1</w:t>
+      </w:r>
+      <w:r>
+        <w:t>).</w:t>
+      </w:r>
+    </w:p>
+    <w:p/>
+    <w:p>
+      <w:r>
+        <w:t xml:space="preserve">Otra incidencia ocurrida en este trámite era la inconsistencia de datos que se creaba si la ejecución del </w:t>
+      </w:r>
+      <w:r>
+        <w:rPr>
+          <w:i/>
+          <w:iCs/>
+        </w:rPr>
+        <w:t>DELETE</w:t>
+      </w:r>
+      <w:r>
+        <w:t xml:space="preserve">, funcionaba para algunas tablas, pero si alguna fallaba, </w:t>
+      </w:r>
+      <w:r>
+        <w:t xml:space="preserve">algunas tablas </w:t>
+      </w:r>
+      <w:r>
+        <w:t>quedaban</w:t>
+      </w:r>
+      <w:r>
+        <w:t xml:space="preserve"> vacías y otras con los registros intactos. Este comportamiento estaba provocado por el uso del </w:t>
+      </w:r>
+      <w:r>
+        <w:rPr>
+          <w:i/>
+          <w:iCs/>
+        </w:rPr>
+        <w:t xml:space="preserve">autocommit </w:t>
+      </w:r>
+      <w:r>
+        <w:t xml:space="preserve">siempre predeterminado a </w:t>
+      </w:r>
+      <w:r>
+        <w:rPr>
+          <w:i/>
+          <w:iCs/>
+        </w:rPr>
+        <w:t>True</w:t>
+      </w:r>
+      <w:r>
+        <w:t xml:space="preserve">. Ante esta incidencia se decidió anular el autocommit y hacer un commit final cuando todas las sentencias </w:t>
+      </w:r>
+      <w:r>
+        <w:rPr>
+          <w:i/>
+          <w:iCs/>
+        </w:rPr>
+        <w:t>DELETE</w:t>
+      </w:r>
+      <w:r>
+        <w:t xml:space="preserve"> estuvieran ejecutadas. Si alguna sentencia daba error, se ejecutaba el </w:t>
+      </w:r>
+      <w:r>
+        <w:rPr>
+          <w:i/>
+          <w:iCs/>
+        </w:rPr>
+        <w:t>rollback</w:t>
+      </w:r>
+      <w:r>
+        <w:t xml:space="preserve"> y todas las tablas volvían a su estado inicial. Al final de la función se reestablecía el </w:t>
+      </w:r>
+      <w:r>
+        <w:rPr>
+          <w:i/>
+          <w:iCs/>
+        </w:rPr>
+        <w:t>autocommit</w:t>
+      </w:r>
+      <w:r>
+        <w:t xml:space="preserve"> a </w:t>
+      </w:r>
+      <w:r>
+        <w:rPr>
+          <w:i/>
+          <w:iCs/>
+        </w:rPr>
+        <w:t>True</w:t>
+      </w:r>
+      <w:r>
+        <w:t>.</w:t>
+      </w:r>
+    </w:p>
+    <w:p/>
+    <w:p>
+      <w:pPr>
+        <w:pStyle w:val="Ttulo3"/>
+        <w:spacing w:line="360" w:lineRule="auto"/>
+      </w:pPr>
+      <w:r>
+        <w:t>Las rutas de los ficheros</w:t>
+      </w:r>
+    </w:p>
+    <w:p>
+      <w:r>
+        <w:t xml:space="preserve">Las operaciones sobre los ficheros de texto almacenados en el entorno se configuraban dentro del fichero </w:t>
+      </w:r>
+      <w:r>
+        <w:rPr>
+          <w:i/>
+          <w:iCs/>
+        </w:rPr>
+        <w:t>base_datos.py</w:t>
+      </w:r>
+      <w:r>
+        <w:t xml:space="preserve">, pero se ejecutaban desde </w:t>
+      </w:r>
+      <w:r>
+        <w:rPr>
+          <w:i/>
+          <w:iCs/>
+        </w:rPr>
+        <w:t>app.py</w:t>
+      </w:r>
+      <w:r>
+        <w:t xml:space="preserve">. Como estos dos ficheros se encontraban en directorios diferentes, la ruta para llegar a los ficheros de texto era diferente, por tanto, las funciones funcionaban se ejecutaban correctamente desde el fichero de </w:t>
+      </w:r>
+      <w:r>
+        <w:rPr>
+          <w:i/>
+          <w:iCs/>
+        </w:rPr>
+        <w:t>base_datos.py</w:t>
+      </w:r>
+      <w:r>
+        <w:t xml:space="preserve">, pero daban error desde el fichero </w:t>
+      </w:r>
+      <w:r>
+        <w:rPr>
+          <w:i/>
+          <w:iCs/>
+        </w:rPr>
+        <w:t>app.py</w:t>
+      </w:r>
+      <w:r>
+        <w:t xml:space="preserve">. En consecuencia, ya que el ejecutable final es </w:t>
+      </w:r>
+      <w:r>
+        <w:rPr>
+          <w:i/>
+          <w:iCs/>
+        </w:rPr>
+        <w:t>app</w:t>
+      </w:r>
+      <w:r>
+        <w:t>.</w:t>
+      </w:r>
+      <w:r>
+        <w:rPr>
+          <w:i/>
+          <w:iCs/>
+        </w:rPr>
+        <w:t>py</w:t>
+      </w:r>
+      <w:r>
+        <w:t>, las rutas se ajustaron para funcionar correctamente desde este fichero.</w:t>
+      </w:r>
+    </w:p>
+    <w:p/>
+    <w:p>
+      <w:r>
+        <w:t>Además, las rutas se tuvieron que ajustar también en los casos de prueba automatizados y en el directorio preparado para el administrador para la instalación y configuración de la aplicación.</w:t>
       </w:r>
     </w:p>
     <w:p/>
@@ -29624,9 +29877,12 @@
     </w:p>
     <w:p>
       <w:pPr>
-        <w:pStyle w:val="Ttulo1"/>
-        <w:jc w:val="center"/>
-        <w:rPr>
+        <w:spacing w:after="200"/>
+        <w:jc w:val="left"/>
+        <w:rPr>
+          <w:rFonts w:asciiTheme="majorHAnsi" w:eastAsiaTheme="majorEastAsia" w:hAnsiTheme="majorHAnsi" w:cstheme="majorBidi"/>
+          <w:color w:val="061F57" w:themeColor="text2" w:themeShade="BF"/>
+          <w:kern w:val="28"/>
           <w:sz w:val="144"/>
           <w:szCs w:val="144"/>
         </w:rPr>
@@ -29634,6 +29890,23 @@
       <w:bookmarkStart w:id="167" w:name="_Toc182218993"/>
       <w:bookmarkStart w:id="168" w:name="_Toc182500171"/>
       <w:bookmarkStart w:id="169" w:name="_Ref230451651"/>
+      <w:r>
+        <w:rPr>
+          <w:sz w:val="144"/>
+          <w:szCs w:val="144"/>
+        </w:rPr>
+        <w:br w:type="page"/>
+      </w:r>
+    </w:p>
+    <w:p>
+      <w:pPr>
+        <w:pStyle w:val="Ttulo1"/>
+        <w:jc w:val="center"/>
+        <w:rPr>
+          <w:sz w:val="144"/>
+          <w:szCs w:val="144"/>
+        </w:rPr>
+      </w:pPr>
       <w:r>
         <w:rPr>
           <w:sz w:val="144"/>
@@ -31033,11 +31306,18 @@
           <w:rFonts w:ascii="Courier New" w:hAnsi="Courier New" w:cs="Courier New"/>
           <w:sz w:val="22"/>
           <w:szCs w:val="22"/>
+          <w:lang w:val="en-US"/>
         </w:rPr>
         <w:t>docker run -d --name mysql_daw1 -e MYSQL_ROOT_PASSWORD=root -p 3306:3306 -v mysql_data:/var/lib/mysql mysql:9.7</w:t>
       </w:r>
       <w:r>
-        <w:t xml:space="preserve">. De está manera se creará el contenedor de la base de datos. </w:t>
+        <w:rPr>
+          <w:lang w:val="en-US"/>
+        </w:rPr>
+        <w:t xml:space="preserve">. </w:t>
+      </w:r>
+      <w:r>
+        <w:t xml:space="preserve">De está manera se creará el contenedor de la base de datos. </w:t>
       </w:r>
     </w:p>
     <w:p>
@@ -31078,10 +31358,13 @@
         <w:pStyle w:val="Prrafodelista"/>
       </w:pPr>
       <w:r>
+        <w:rPr>
+          <w:noProof/>
+        </w:rPr>
         <w:drawing>
-          <wp:inline distT="0" distB="0" distL="0" distR="0" wp14:anchorId="198A5D08" wp14:editId="6DD714FD">
-            <wp:extent cx="6053137" cy="472958"/>
-            <wp:effectExtent l="0" t="0" r="0" b="3810"/>
+          <wp:inline distT="0" distB="0" distL="0" distR="0" wp14:anchorId="198A5D08" wp14:editId="5D97236E">
+            <wp:extent cx="5953530" cy="465176"/>
+            <wp:effectExtent l="0" t="0" r="0" b="0"/>
             <wp:docPr id="259552596" name="Imagen 1"/>
             <wp:cNvGraphicFramePr>
               <a:graphicFrameLocks xmlns:a="http://schemas.openxmlformats.org/drawingml/2006/main" noChangeAspect="1"/>
@@ -31102,7 +31385,7 @@
                   <pic:spPr>
                     <a:xfrm>
                       <a:off x="0" y="0"/>
-                      <a:ext cx="6235087" cy="487175"/>
+                      <a:ext cx="6166006" cy="481778"/>
                     </a:xfrm>
                     <a:prstGeom prst="rect">
                       <a:avLst/>
@@ -31586,14 +31869,7 @@
           <w:noProof/>
           <w:color w:val="5951C8" w:themeColor="text1" w:themeTint="80"/>
         </w:rPr>
-        <w:t>3</w:t>
-      </w:r>
-      <w:r>
-        <w:rPr>
-          <w:noProof/>
-          <w:color w:val="5951C8" w:themeColor="text1" w:themeTint="80"/>
-        </w:rPr>
-        <w:t>7</w:t>
+        <w:t>37</w:t>
       </w:r>
       <w:r>
         <w:rPr>
@@ -32076,15 +32352,7 @@
           <w:sz w:val="28"/>
           <w:szCs w:val="28"/>
         </w:rPr>
-        <w:t xml:space="preserve">Creación y configuración de la Base de Datos desde </w:t>
-      </w:r>
-      <w:r>
-        <w:rPr>
-          <w:rFonts w:asciiTheme="minorHAnsi" w:hAnsiTheme="minorHAnsi" w:cstheme="minorHAnsi"/>
-          <w:sz w:val="28"/>
-          <w:szCs w:val="28"/>
-        </w:rPr>
-        <w:t>PowerShell</w:t>
+        <w:t>Creación y configuración de la Base de Datos desde PowerShell</w:t>
       </w:r>
       <w:r>
         <w:rPr>
@@ -32387,9 +32655,6 @@
     <w:p>
       <w:pPr>
         <w:pStyle w:val="Ttulo2"/>
-        <w:rPr>
-          <w:color w:val="EE0000"/>
-        </w:rPr>
       </w:pPr>
       <w:r>
         <w:t>Mejoras posibles</w:t>
@@ -32403,12 +32668,92 @@
     </w:p>
     <w:p>
       <w:pPr>
-        <w:pStyle w:val="Ttulo2"/>
+        <w:pStyle w:val="Prrafodelista"/>
+        <w:numPr>
+          <w:ilvl w:val="0"/>
+          <w:numId w:val="24"/>
+        </w:numPr>
+      </w:pPr>
+      <w:r>
+        <w:t>En el código se uso demasiada recursividad. En caso de error sería más conveniente basarse en FIN y usar True y False, que poner más “capas” de funciones.</w:t>
+      </w:r>
+    </w:p>
+    <w:p>
+      <w:pPr>
+        <w:pStyle w:val="Prrafodelista"/>
+      </w:pPr>
+    </w:p>
+    <w:p>
+      <w:pPr>
+        <w:pStyle w:val="Prrafodelista"/>
+        <w:numPr>
+          <w:ilvl w:val="0"/>
+          <w:numId w:val="24"/>
+        </w:numPr>
+      </w:pPr>
+      <w:r>
+        <w:t>A la hora de visualizar las guardias semanales no está prevista la opción de volver al menú principal, solo la de cambiar fecha o salir de la app.</w:t>
+      </w:r>
+    </w:p>
+    <w:p>
+      <w:pPr>
+        <w:pStyle w:val="Prrafodelista"/>
+      </w:pPr>
+    </w:p>
+    <w:p>
+      <w:pPr>
+        <w:pStyle w:val="Prrafodelista"/>
+        <w:numPr>
+          <w:ilvl w:val="0"/>
+          <w:numId w:val="24"/>
+        </w:numPr>
+      </w:pPr>
+      <w:r>
+        <w:t xml:space="preserve">Además, para evitar futuras confusiones sería conveniente restringir las altas de guardias anteriores a la fecha actual. </w:t>
+      </w:r>
+    </w:p>
+    <w:p>
+      <w:pPr>
+        <w:pStyle w:val="Prrafodelista"/>
+      </w:pPr>
+    </w:p>
+    <w:p>
+      <w:pPr>
+        <w:pStyle w:val="Prrafodelista"/>
+        <w:numPr>
+          <w:ilvl w:val="0"/>
+          <w:numId w:val="24"/>
+        </w:numPr>
+      </w:pPr>
+      <w:r>
+        <w:t>Los ficheros que se añaden al crear la guardia, no son realmente ficheros, sino que simplemente nombres de ficheros. Sería una mejora considerable la posibilidad de subir ficheros directamente en formatos como pdf, docx, etc.</w:t>
+      </w:r>
+    </w:p>
+    <w:p/>
+    <w:p>
+      <w:pPr>
+        <w:spacing w:after="200"/>
+        <w:jc w:val="left"/>
+        <w:rPr>
+          <w:rFonts w:eastAsiaTheme="majorEastAsia" w:cstheme="majorBidi"/>
+          <w:b/>
+          <w:sz w:val="36"/>
+          <w:szCs w:val="26"/>
+        </w:rPr>
       </w:pPr>
       <w:bookmarkStart w:id="179" w:name="_Toc49341877"/>
       <w:bookmarkStart w:id="180" w:name="_Toc182218998"/>
       <w:bookmarkStart w:id="181" w:name="_Toc182500176"/>
       <w:r>
+        <w:br w:type="page"/>
+      </w:r>
+    </w:p>
+    <w:p>
+      <w:pPr>
+        <w:pStyle w:val="Ttulo2"/>
+      </w:pPr>
+      <w:r>
+        <w:lastRenderedPageBreak/>
         <w:t>Manual de usuario</w:t>
       </w:r>
       <w:bookmarkEnd w:id="179"/>
@@ -32449,6 +32794,28 @@
           <w:lang w:bidi="es-ES"/>
         </w:rPr>
       </w:pPr>
+    </w:p>
+    <w:p>
+      <w:pPr>
+        <w:spacing w:after="200"/>
+        <w:jc w:val="left"/>
+        <w:rPr>
+          <w:rFonts w:asciiTheme="majorHAnsi" w:eastAsiaTheme="majorEastAsia" w:hAnsiTheme="majorHAnsi" w:cstheme="majorBidi"/>
+          <w:color w:val="061F57" w:themeColor="text2" w:themeShade="BF"/>
+          <w:kern w:val="28"/>
+          <w:sz w:val="144"/>
+          <w:szCs w:val="144"/>
+          <w:lang w:bidi="es-ES"/>
+        </w:rPr>
+      </w:pPr>
+      <w:r>
+        <w:rPr>
+          <w:sz w:val="144"/>
+          <w:szCs w:val="144"/>
+          <w:lang w:bidi="es-ES"/>
+        </w:rPr>
+        <w:br w:type="page"/>
+      </w:r>
     </w:p>
     <w:p>
       <w:pPr>
@@ -41615,6 +41982,95 @@
     </w:lvl>
   </w:abstractNum>
   <w:abstractNum w:abstractNumId="4" w15:restartNumberingAfterBreak="0">
+    <w:nsid w:val="1C646FA2"/>
+    <w:multiLevelType w:val="hybridMultilevel"/>
+    <w:tmpl w:val="F160900E"/>
+    <w:lvl w:ilvl="0" w:tplc="36F48BE2">
+      <w:start w:val="1"/>
+      <w:numFmt w:val="decimal"/>
+      <w:lvlText w:val="%1-"/>
+      <w:lvlJc w:val="left"/>
+      <w:pPr>
+        <w:ind w:left="720" w:hanging="360"/>
+      </w:pPr>
+      <w:rPr>
+        <w:rFonts w:hint="default"/>
+      </w:rPr>
+    </w:lvl>
+    <w:lvl w:ilvl="1" w:tplc="0C0A0019" w:tentative="1">
+      <w:start w:val="1"/>
+      <w:numFmt w:val="lowerLetter"/>
+      <w:lvlText w:val="%2."/>
+      <w:lvlJc w:val="left"/>
+      <w:pPr>
+        <w:ind w:left="1440" w:hanging="360"/>
+      </w:pPr>
+    </w:lvl>
+    <w:lvl w:ilvl="2" w:tplc="0C0A001B" w:tentative="1">
+      <w:start w:val="1"/>
+      <w:numFmt w:val="lowerRoman"/>
+      <w:lvlText w:val="%3."/>
+      <w:lvlJc w:val="right"/>
+      <w:pPr>
+        <w:ind w:left="2160" w:hanging="180"/>
+      </w:pPr>
+    </w:lvl>
+    <w:lvl w:ilvl="3" w:tplc="0C0A000F" w:tentative="1">
+      <w:start w:val="1"/>
+      <w:numFmt w:val="decimal"/>
+      <w:lvlText w:val="%4."/>
+      <w:lvlJc w:val="left"/>
+      <w:pPr>
+        <w:ind w:left="2880" w:hanging="360"/>
+      </w:pPr>
+    </w:lvl>
+    <w:lvl w:ilvl="4" w:tplc="0C0A0019" w:tentative="1">
+      <w:start w:val="1"/>
+      <w:numFmt w:val="lowerLetter"/>
+      <w:lvlText w:val="%5."/>
+      <w:lvlJc w:val="left"/>
+      <w:pPr>
+        <w:ind w:left="3600" w:hanging="360"/>
+      </w:pPr>
+    </w:lvl>
+    <w:lvl w:ilvl="5" w:tplc="0C0A001B" w:tentative="1">
+      <w:start w:val="1"/>
+      <w:numFmt w:val="lowerRoman"/>
+      <w:lvlText w:val="%6."/>
+      <w:lvlJc w:val="right"/>
+      <w:pPr>
+        <w:ind w:left="4320" w:hanging="180"/>
+      </w:pPr>
+    </w:lvl>
+    <w:lvl w:ilvl="6" w:tplc="0C0A000F" w:tentative="1">
+      <w:start w:val="1"/>
+      <w:numFmt w:val="decimal"/>
+      <w:lvlText w:val="%7."/>
+      <w:lvlJc w:val="left"/>
+      <w:pPr>
+        <w:ind w:left="5040" w:hanging="360"/>
+      </w:pPr>
+    </w:lvl>
+    <w:lvl w:ilvl="7" w:tplc="0C0A0019" w:tentative="1">
+      <w:start w:val="1"/>
+      <w:numFmt w:val="lowerLetter"/>
+      <w:lvlText w:val="%8."/>
+      <w:lvlJc w:val="left"/>
+      <w:pPr>
+        <w:ind w:left="5760" w:hanging="360"/>
+      </w:pPr>
+    </w:lvl>
+    <w:lvl w:ilvl="8" w:tplc="0C0A001B" w:tentative="1">
+      <w:start w:val="1"/>
+      <w:numFmt w:val="lowerRoman"/>
+      <w:lvlText w:val="%9."/>
+      <w:lvlJc w:val="right"/>
+      <w:pPr>
+        <w:ind w:left="6480" w:hanging="180"/>
+      </w:pPr>
+    </w:lvl>
+  </w:abstractNum>
+  <w:abstractNum w:abstractNumId="5" w15:restartNumberingAfterBreak="0">
     <w:nsid w:val="234B39CF"/>
     <w:multiLevelType w:val="hybridMultilevel"/>
     <w:tmpl w:val="3EB2AEA2"/>
@@ -41703,7 +42159,7 @@
       </w:pPr>
     </w:lvl>
   </w:abstractNum>
-  <w:abstractNum w:abstractNumId="5" w15:restartNumberingAfterBreak="0">
+  <w:abstractNum w:abstractNumId="6" w15:restartNumberingAfterBreak="0">
     <w:nsid w:val="30031545"/>
     <w:multiLevelType w:val="hybridMultilevel"/>
     <w:tmpl w:val="3A9E44FA"/>
@@ -41816,7 +42272,185 @@
       </w:rPr>
     </w:lvl>
   </w:abstractNum>
-  <w:abstractNum w:abstractNumId="6" w15:restartNumberingAfterBreak="0">
+  <w:abstractNum w:abstractNumId="7" w15:restartNumberingAfterBreak="0">
+    <w:nsid w:val="31303AC5"/>
+    <w:multiLevelType w:val="hybridMultilevel"/>
+    <w:tmpl w:val="5798E29C"/>
+    <w:lvl w:ilvl="0" w:tplc="5288B44C">
+      <w:start w:val="1"/>
+      <w:numFmt w:val="decimal"/>
+      <w:lvlText w:val="%1-"/>
+      <w:lvlJc w:val="left"/>
+      <w:pPr>
+        <w:ind w:left="720" w:hanging="360"/>
+      </w:pPr>
+      <w:rPr>
+        <w:rFonts w:hint="default"/>
+      </w:rPr>
+    </w:lvl>
+    <w:lvl w:ilvl="1" w:tplc="0C0A0019" w:tentative="1">
+      <w:start w:val="1"/>
+      <w:numFmt w:val="lowerLetter"/>
+      <w:lvlText w:val="%2."/>
+      <w:lvlJc w:val="left"/>
+      <w:pPr>
+        <w:ind w:left="1440" w:hanging="360"/>
+      </w:pPr>
+    </w:lvl>
+    <w:lvl w:ilvl="2" w:tplc="0C0A001B" w:tentative="1">
+      <w:start w:val="1"/>
+      <w:numFmt w:val="lowerRoman"/>
+      <w:lvlText w:val="%3."/>
+      <w:lvlJc w:val="right"/>
+      <w:pPr>
+        <w:ind w:left="2160" w:hanging="180"/>
+      </w:pPr>
+    </w:lvl>
+    <w:lvl w:ilvl="3" w:tplc="0C0A000F" w:tentative="1">
+      <w:start w:val="1"/>
+      <w:numFmt w:val="decimal"/>
+      <w:lvlText w:val="%4."/>
+      <w:lvlJc w:val="left"/>
+      <w:pPr>
+        <w:ind w:left="2880" w:hanging="360"/>
+      </w:pPr>
+    </w:lvl>
+    <w:lvl w:ilvl="4" w:tplc="0C0A0019" w:tentative="1">
+      <w:start w:val="1"/>
+      <w:numFmt w:val="lowerLetter"/>
+      <w:lvlText w:val="%5."/>
+      <w:lvlJc w:val="left"/>
+      <w:pPr>
+        <w:ind w:left="3600" w:hanging="360"/>
+      </w:pPr>
+    </w:lvl>
+    <w:lvl w:ilvl="5" w:tplc="0C0A001B" w:tentative="1">
+      <w:start w:val="1"/>
+      <w:numFmt w:val="lowerRoman"/>
+      <w:lvlText w:val="%6."/>
+      <w:lvlJc w:val="right"/>
+      <w:pPr>
+        <w:ind w:left="4320" w:hanging="180"/>
+      </w:pPr>
+    </w:lvl>
+    <w:lvl w:ilvl="6" w:tplc="0C0A000F" w:tentative="1">
+      <w:start w:val="1"/>
+      <w:numFmt w:val="decimal"/>
+      <w:lvlText w:val="%7."/>
+      <w:lvlJc w:val="left"/>
+      <w:pPr>
+        <w:ind w:left="5040" w:hanging="360"/>
+      </w:pPr>
+    </w:lvl>
+    <w:lvl w:ilvl="7" w:tplc="0C0A0019" w:tentative="1">
+      <w:start w:val="1"/>
+      <w:numFmt w:val="lowerLetter"/>
+      <w:lvlText w:val="%8."/>
+      <w:lvlJc w:val="left"/>
+      <w:pPr>
+        <w:ind w:left="5760" w:hanging="360"/>
+      </w:pPr>
+    </w:lvl>
+    <w:lvl w:ilvl="8" w:tplc="0C0A001B" w:tentative="1">
+      <w:start w:val="1"/>
+      <w:numFmt w:val="lowerRoman"/>
+      <w:lvlText w:val="%9."/>
+      <w:lvlJc w:val="right"/>
+      <w:pPr>
+        <w:ind w:left="6480" w:hanging="180"/>
+      </w:pPr>
+    </w:lvl>
+  </w:abstractNum>
+  <w:abstractNum w:abstractNumId="8" w15:restartNumberingAfterBreak="0">
+    <w:nsid w:val="37FC06AC"/>
+    <w:multiLevelType w:val="hybridMultilevel"/>
+    <w:tmpl w:val="854426D6"/>
+    <w:lvl w:ilvl="0" w:tplc="0C0A000F">
+      <w:start w:val="1"/>
+      <w:numFmt w:val="decimal"/>
+      <w:lvlText w:val="%1."/>
+      <w:lvlJc w:val="left"/>
+      <w:pPr>
+        <w:ind w:left="720" w:hanging="360"/>
+      </w:pPr>
+      <w:rPr>
+        <w:rFonts w:hint="default"/>
+      </w:rPr>
+    </w:lvl>
+    <w:lvl w:ilvl="1" w:tplc="0C0A0019" w:tentative="1">
+      <w:start w:val="1"/>
+      <w:numFmt w:val="lowerLetter"/>
+      <w:lvlText w:val="%2."/>
+      <w:lvlJc w:val="left"/>
+      <w:pPr>
+        <w:ind w:left="1440" w:hanging="360"/>
+      </w:pPr>
+    </w:lvl>
+    <w:lvl w:ilvl="2" w:tplc="0C0A001B" w:tentative="1">
+      <w:start w:val="1"/>
+      <w:numFmt w:val="lowerRoman"/>
+      <w:lvlText w:val="%3."/>
+      <w:lvlJc w:val="right"/>
+      <w:pPr>
+        <w:ind w:left="2160" w:hanging="180"/>
+      </w:pPr>
+    </w:lvl>
+    <w:lvl w:ilvl="3" w:tplc="0C0A000F" w:tentative="1">
+      <w:start w:val="1"/>
+      <w:numFmt w:val="decimal"/>
+      <w:lvlText w:val="%4."/>
+      <w:lvlJc w:val="left"/>
+      <w:pPr>
+        <w:ind w:left="2880" w:hanging="360"/>
+      </w:pPr>
+    </w:lvl>
+    <w:lvl w:ilvl="4" w:tplc="0C0A0019" w:tentative="1">
+      <w:start w:val="1"/>
+      <w:numFmt w:val="lowerLetter"/>
+      <w:lvlText w:val="%5."/>
+      <w:lvlJc w:val="left"/>
+      <w:pPr>
+        <w:ind w:left="3600" w:hanging="360"/>
+      </w:pPr>
+    </w:lvl>
+    <w:lvl w:ilvl="5" w:tplc="0C0A001B" w:tentative="1">
+      <w:start w:val="1"/>
+      <w:numFmt w:val="lowerRoman"/>
+      <w:lvlText w:val="%6."/>
+      <w:lvlJc w:val="right"/>
+      <w:pPr>
+        <w:ind w:left="4320" w:hanging="180"/>
+      </w:pPr>
+    </w:lvl>
+    <w:lvl w:ilvl="6" w:tplc="0C0A000F" w:tentative="1">
+      <w:start w:val="1"/>
+      <w:numFmt w:val="decimal"/>
+      <w:lvlText w:val="%7."/>
+      <w:lvlJc w:val="left"/>
+      <w:pPr>
+        <w:ind w:left="5040" w:hanging="360"/>
+      </w:pPr>
+    </w:lvl>
+    <w:lvl w:ilvl="7" w:tplc="0C0A0019" w:tentative="1">
+      <w:start w:val="1"/>
+      <w:numFmt w:val="lowerLetter"/>
+      <w:lvlText w:val="%8."/>
+      <w:lvlJc w:val="left"/>
+      <w:pPr>
+        <w:ind w:left="5760" w:hanging="360"/>
+      </w:pPr>
+    </w:lvl>
+    <w:lvl w:ilvl="8" w:tplc="0C0A001B" w:tentative="1">
+      <w:start w:val="1"/>
+      <w:numFmt w:val="lowerRoman"/>
+      <w:lvlText w:val="%9."/>
+      <w:lvlJc w:val="right"/>
+      <w:pPr>
+        <w:ind w:left="6480" w:hanging="180"/>
+      </w:pPr>
+    </w:lvl>
+  </w:abstractNum>
+  <w:abstractNum w:abstractNumId="9" w15:restartNumberingAfterBreak="0">
     <w:nsid w:val="408734B4"/>
     <w:multiLevelType w:val="hybridMultilevel"/>
     <w:tmpl w:val="2D56C700"/>
@@ -41929,7 +42563,7 @@
       </w:rPr>
     </w:lvl>
   </w:abstractNum>
-  <w:abstractNum w:abstractNumId="7" w15:restartNumberingAfterBreak="0">
+  <w:abstractNum w:abstractNumId="10" w15:restartNumberingAfterBreak="0">
     <w:nsid w:val="415F2157"/>
     <w:multiLevelType w:val="hybridMultilevel"/>
     <w:tmpl w:val="8C52AE3E"/>
@@ -42042,7 +42676,7 @@
       </w:rPr>
     </w:lvl>
   </w:abstractNum>
-  <w:abstractNum w:abstractNumId="8" w15:restartNumberingAfterBreak="0">
+  <w:abstractNum w:abstractNumId="11" w15:restartNumberingAfterBreak="0">
     <w:nsid w:val="46D2207E"/>
     <w:multiLevelType w:val="hybridMultilevel"/>
     <w:tmpl w:val="7F6A73AA"/>
@@ -42155,7 +42789,7 @@
       </w:rPr>
     </w:lvl>
   </w:abstractNum>
-  <w:abstractNum w:abstractNumId="9" w15:restartNumberingAfterBreak="0">
+  <w:abstractNum w:abstractNumId="12" w15:restartNumberingAfterBreak="0">
     <w:nsid w:val="49174A88"/>
     <w:multiLevelType w:val="hybridMultilevel"/>
     <w:tmpl w:val="A3DEF222"/>
@@ -42268,7 +42902,7 @@
       </w:rPr>
     </w:lvl>
   </w:abstractNum>
-  <w:abstractNum w:abstractNumId="10" w15:restartNumberingAfterBreak="0">
+  <w:abstractNum w:abstractNumId="13" w15:restartNumberingAfterBreak="0">
     <w:nsid w:val="4C27462A"/>
     <w:multiLevelType w:val="hybridMultilevel"/>
     <w:tmpl w:val="D5AE26E6"/>
@@ -42381,7 +43015,7 @@
       </w:rPr>
     </w:lvl>
   </w:abstractNum>
-  <w:abstractNum w:abstractNumId="11" w15:restartNumberingAfterBreak="0">
+  <w:abstractNum w:abstractNumId="14" w15:restartNumberingAfterBreak="0">
     <w:nsid w:val="4DD8196B"/>
     <w:multiLevelType w:val="hybridMultilevel"/>
     <w:tmpl w:val="3EB2AEA2"/>
@@ -42470,7 +43104,7 @@
       </w:pPr>
     </w:lvl>
   </w:abstractNum>
-  <w:abstractNum w:abstractNumId="12" w15:restartNumberingAfterBreak="0">
+  <w:abstractNum w:abstractNumId="15" w15:restartNumberingAfterBreak="0">
     <w:nsid w:val="50365BD4"/>
     <w:multiLevelType w:val="hybridMultilevel"/>
     <w:tmpl w:val="209C7EF0"/>
@@ -42561,7 +43195,7 @@
       </w:pPr>
     </w:lvl>
   </w:abstractNum>
-  <w:abstractNum w:abstractNumId="13" w15:restartNumberingAfterBreak="0">
+  <w:abstractNum w:abstractNumId="16" w15:restartNumberingAfterBreak="0">
     <w:nsid w:val="54E76D80"/>
     <w:multiLevelType w:val="hybridMultilevel"/>
     <w:tmpl w:val="4CAAA5CC"/>
@@ -42674,7 +43308,7 @@
       </w:rPr>
     </w:lvl>
   </w:abstractNum>
-  <w:abstractNum w:abstractNumId="14" w15:restartNumberingAfterBreak="0">
+  <w:abstractNum w:abstractNumId="17" w15:restartNumberingAfterBreak="0">
     <w:nsid w:val="56DC0F4F"/>
     <w:multiLevelType w:val="hybridMultilevel"/>
     <w:tmpl w:val="DBDE6AE6"/>
@@ -42787,7 +43421,7 @@
       </w:rPr>
     </w:lvl>
   </w:abstractNum>
-  <w:abstractNum w:abstractNumId="15" w15:restartNumberingAfterBreak="0">
+  <w:abstractNum w:abstractNumId="18" w15:restartNumberingAfterBreak="0">
     <w:nsid w:val="584108BF"/>
     <w:multiLevelType w:val="hybridMultilevel"/>
     <w:tmpl w:val="720A6B12"/>
@@ -42900,7 +43534,7 @@
       </w:rPr>
     </w:lvl>
   </w:abstractNum>
-  <w:abstractNum w:abstractNumId="16" w15:restartNumberingAfterBreak="0">
+  <w:abstractNum w:abstractNumId="19" w15:restartNumberingAfterBreak="0">
     <w:nsid w:val="62CE41E6"/>
     <w:multiLevelType w:val="hybridMultilevel"/>
     <w:tmpl w:val="629A35CE"/>
@@ -42989,7 +43623,7 @@
       </w:pPr>
     </w:lvl>
   </w:abstractNum>
-  <w:abstractNum w:abstractNumId="17" w15:restartNumberingAfterBreak="0">
+  <w:abstractNum w:abstractNumId="20" w15:restartNumberingAfterBreak="0">
     <w:nsid w:val="780E04D7"/>
     <w:multiLevelType w:val="hybridMultilevel"/>
     <w:tmpl w:val="AAA02FD2"/>
@@ -43102,7 +43736,7 @@
       </w:rPr>
     </w:lvl>
   </w:abstractNum>
-  <w:abstractNum w:abstractNumId="18" w15:restartNumberingAfterBreak="0">
+  <w:abstractNum w:abstractNumId="21" w15:restartNumberingAfterBreak="0">
     <w:nsid w:val="79306B18"/>
     <w:multiLevelType w:val="hybridMultilevel"/>
     <w:tmpl w:val="B02AD490"/>
@@ -43215,7 +43849,7 @@
       </w:rPr>
     </w:lvl>
   </w:abstractNum>
-  <w:abstractNum w:abstractNumId="19" w15:restartNumberingAfterBreak="0">
+  <w:abstractNum w:abstractNumId="22" w15:restartNumberingAfterBreak="0">
     <w:nsid w:val="79E3477E"/>
     <w:multiLevelType w:val="hybridMultilevel"/>
     <w:tmpl w:val="A4C6C246"/>
@@ -43304,7 +43938,7 @@
       </w:pPr>
     </w:lvl>
   </w:abstractNum>
-  <w:abstractNum w:abstractNumId="20" w15:restartNumberingAfterBreak="0">
+  <w:abstractNum w:abstractNumId="23" w15:restartNumberingAfterBreak="0">
     <w:nsid w:val="7D364821"/>
     <w:multiLevelType w:val="hybridMultilevel"/>
     <w:tmpl w:val="8BACD71C"/>
@@ -43394,67 +44028,76 @@
     </w:lvl>
   </w:abstractNum>
   <w:num w:numId="1" w16cid:durableId="1264800247">
-    <w:abstractNumId w:val="17"/>
+    <w:abstractNumId w:val="20"/>
   </w:num>
   <w:num w:numId="2" w16cid:durableId="1848666731">
-    <w:abstractNumId w:val="13"/>
+    <w:abstractNumId w:val="16"/>
   </w:num>
   <w:num w:numId="3" w16cid:durableId="556431196">
     <w:abstractNumId w:val="1"/>
   </w:num>
   <w:num w:numId="4" w16cid:durableId="1217467586">
-    <w:abstractNumId w:val="9"/>
+    <w:abstractNumId w:val="12"/>
   </w:num>
   <w:num w:numId="5" w16cid:durableId="620041898">
-    <w:abstractNumId w:val="7"/>
+    <w:abstractNumId w:val="10"/>
   </w:num>
   <w:num w:numId="6" w16cid:durableId="2026710683">
     <w:abstractNumId w:val="3"/>
   </w:num>
   <w:num w:numId="7" w16cid:durableId="1017121877">
-    <w:abstractNumId w:val="15"/>
+    <w:abstractNumId w:val="18"/>
   </w:num>
   <w:num w:numId="8" w16cid:durableId="1962809096">
-    <w:abstractNumId w:val="5"/>
+    <w:abstractNumId w:val="6"/>
   </w:num>
   <w:num w:numId="9" w16cid:durableId="19283992">
-    <w:abstractNumId w:val="8"/>
+    <w:abstractNumId w:val="11"/>
   </w:num>
   <w:num w:numId="10" w16cid:durableId="1822650518">
-    <w:abstractNumId w:val="14"/>
+    <w:abstractNumId w:val="17"/>
   </w:num>
   <w:num w:numId="11" w16cid:durableId="301691016">
-    <w:abstractNumId w:val="10"/>
+    <w:abstractNumId w:val="13"/>
   </w:num>
   <w:num w:numId="12" w16cid:durableId="517739745">
-    <w:abstractNumId w:val="18"/>
+    <w:abstractNumId w:val="21"/>
   </w:num>
   <w:num w:numId="13" w16cid:durableId="344672934">
     <w:abstractNumId w:val="0"/>
   </w:num>
   <w:num w:numId="14" w16cid:durableId="1212763014">
-    <w:abstractNumId w:val="6"/>
+    <w:abstractNumId w:val="9"/>
   </w:num>
   <w:num w:numId="15" w16cid:durableId="264197226">
     <w:abstractNumId w:val="2"/>
   </w:num>
   <w:num w:numId="16" w16cid:durableId="1637641333">
-    <w:abstractNumId w:val="11"/>
+    <w:abstractNumId w:val="14"/>
   </w:num>
   <w:num w:numId="17" w16cid:durableId="1902062377">
+    <w:abstractNumId w:val="5"/>
+  </w:num>
+  <w:num w:numId="18" w16cid:durableId="2113738951">
+    <w:abstractNumId w:val="19"/>
+  </w:num>
+  <w:num w:numId="19" w16cid:durableId="1304235765">
+    <w:abstractNumId w:val="15"/>
+  </w:num>
+  <w:num w:numId="20" w16cid:durableId="1808933161">
+    <w:abstractNumId w:val="22"/>
+  </w:num>
+  <w:num w:numId="21" w16cid:durableId="1456679016">
+    <w:abstractNumId w:val="23"/>
+  </w:num>
+  <w:num w:numId="22" w16cid:durableId="1799568895">
     <w:abstractNumId w:val="4"/>
   </w:num>
-  <w:num w:numId="18" w16cid:durableId="2113738951">
-    <w:abstractNumId w:val="16"/>
+  <w:num w:numId="23" w16cid:durableId="1774475831">
+    <w:abstractNumId w:val="7"/>
   </w:num>
-  <w:num w:numId="19" w16cid:durableId="1304235765">
-    <w:abstractNumId w:val="12"/>
-  </w:num>
-  <w:num w:numId="20" w16cid:durableId="1808933161">
-    <w:abstractNumId w:val="19"/>
-  </w:num>
-  <w:num w:numId="21" w16cid:durableId="1456679016">
-    <w:abstractNumId w:val="20"/>
+  <w:num w:numId="24" w16cid:durableId="2112627405">
+    <w:abstractNumId w:val="8"/>
   </w:num>
   <w:numIdMacAtCleanup w:val="9"/>
 </w:numbering>
@@ -45439,6 +46082,7 @@
     <w:rsid w:val="00962633"/>
     <w:rsid w:val="00963B15"/>
     <w:rsid w:val="009645DB"/>
+    <w:rsid w:val="009A2AA2"/>
     <w:rsid w:val="009C318C"/>
     <w:rsid w:val="009C5A38"/>
     <w:rsid w:val="009D0F67"/>
@@ -45484,6 +46128,7 @@
     <w:rsid w:val="00F5150F"/>
     <w:rsid w:val="00FA2BCD"/>
     <w:rsid w:val="00FB3069"/>
+    <w:rsid w:val="00FC77E4"/>
     <w:rsid w:val="00FD51C7"/>
   </w:rsids>
   <m:mathPr>

</xml_diff>